<commit_message>
docs: RAG defect recorded as fixed, verified end-to-end results added
The limitations entry still described embeddings as feature hashing and the
report still carried it as an open defect. Both now state what was measured:
0.151 under hashing against 0.769 under the sentence encoder on the paraphrase
pair, and 0.756 for a retrieval with no content word in common.

The Word report gains a section of eight questions run against the live stack,
each showing which pipeline the router chose and what came out.

Co-Authored-By: Claude Opus 5 <noreply@anthropic.com>
</commit_message>
<xml_diff>
--- a/docs/Project-1-Praxis-RAG-NeuroSymbolic.docx
+++ b/docs/Project-1-Praxis-RAG-NeuroSymbolic.docx
@@ -2885,6 +2885,86 @@
                 <w:sz w:val="19"/>
                 <w:szCs w:val="19"/>
               </w:rPr>
+              <w:t xml:space="preserve">embedding_provider</w:t>
+            </w:r>
+          </w:p>
+        </w:tc>
+        <w:tc>
+          <w:tcPr>
+            <w:tcW w:type="dxa" w:w="2059"/>
+            <w:shd w:fill="F4F6FA" w:val="clear"/>
+            <w:tcMar>
+              <w:top w:type="dxa" w:w="80"/>
+              <w:left w:type="dxa" w:w="120"/>
+              <w:bottom w:type="dxa" w:w="80"/>
+              <w:right w:type="dxa" w:w="120"/>
+            </w:tcMar>
+          </w:tcPr>
+          <w:p>
+            <w:pPr>
+              <w:spacing w:after="0"/>
+            </w:pPr>
+            <w:r>
+              <w:rPr>
+                <w:rFonts w:ascii="Consolas" w:cs="Consolas" w:eastAsia="Consolas" w:hAnsi="Consolas"/>
+                <w:b w:val="false"/>
+                <w:bCs w:val="false"/>
+                <w:sz w:val="18"/>
+                <w:szCs w:val="18"/>
+              </w:rPr>
+              <w:t xml:space="preserve">semantic</w:t>
+            </w:r>
+          </w:p>
+        </w:tc>
+        <w:tc>
+          <w:tcPr>
+            <w:tcW w:type="dxa" w:w="4493"/>
+            <w:shd w:fill="F4F6FA" w:val="clear"/>
+            <w:tcMar>
+              <w:top w:type="dxa" w:w="80"/>
+              <w:left w:type="dxa" w:w="120"/>
+              <w:bottom w:type="dxa" w:w="80"/>
+              <w:right w:type="dxa" w:w="120"/>
+            </w:tcMar>
+          </w:tcPr>
+          <w:p>
+            <w:pPr>
+              <w:spacing w:after="0"/>
+            </w:pPr>
+            <w:r>
+              <w:rPr>
+                <w:b w:val="false"/>
+                <w:bCs w:val="false"/>
+                <w:sz w:val="19"/>
+                <w:szCs w:val="19"/>
+              </w:rPr>
+              <w:t xml:space="preserve">was hashing - see below</w:t>
+            </w:r>
+          </w:p>
+        </w:tc>
+      </w:tr>
+      <w:tr>
+        <w:tc>
+          <w:tcPr>
+            <w:tcW w:type="dxa" w:w="2808"/>
+            <w:tcMar>
+              <w:top w:type="dxa" w:w="80"/>
+              <w:left w:type="dxa" w:w="120"/>
+              <w:bottom w:type="dxa" w:w="80"/>
+              <w:right w:type="dxa" w:w="120"/>
+            </w:tcMar>
+          </w:tcPr>
+          <w:p>
+            <w:pPr>
+              <w:spacing w:after="0"/>
+            </w:pPr>
+            <w:r>
+              <w:rPr>
+                <w:b w:val="false"/>
+                <w:bCs w:val="false"/>
+                <w:sz w:val="19"/>
+                <w:szCs w:val="19"/>
+              </w:rPr>
               <w:t xml:space="preserve">encoder</w:t>
             </w:r>
           </w:p>
@@ -2892,7 +2972,6 @@
         <w:tc>
           <w:tcPr>
             <w:tcW w:type="dxa" w:w="2059"/>
-            <w:shd w:fill="F4F6FA" w:val="clear"/>
             <w:tcMar>
               <w:top w:type="dxa" w:w="80"/>
               <w:left w:type="dxa" w:w="120"/>
@@ -2918,7 +2997,6 @@
         <w:tc>
           <w:tcPr>
             <w:tcW w:type="dxa" w:w="4493"/>
-            <w:shd w:fill="F4F6FA" w:val="clear"/>
             <w:tcMar>
               <w:top w:type="dxa" w:w="80"/>
               <w:left w:type="dxa" w:w="120"/>
@@ -2956,9 +3034,9 @@
     <w:p>
       <w:pPr>
         <w:pBdr>
-          <w:left w:val="single" w:color="C77700" w:sz="18" w:space="10"/>
+          <w:left w:val="single" w:color="2E7D32" w:sz="18" w:space="10"/>
         </w:pBdr>
-        <w:shd w:fill="FFF4E5" w:val="clear"/>
+        <w:shd w:fill="EAF1DD" w:val="clear"/>
         <w:spacing w:after="220" w:before="180"/>
         <w:ind w:left="160" w:right="160"/>
       </w:pPr>
@@ -2969,7 +3047,7 @@
           <w:sz w:val="20"/>
           <w:szCs w:val="20"/>
         </w:rPr>
-        <w:t xml:space="preserve">Known defect, currently being corrected</w:t>
+        <w:t xml:space="preserve">A defect found and corrected during this work</w:t>
       </w:r>
       <w:r>
         <w:br/>
@@ -2979,7 +3057,7 @@
           <w:sz w:val="20"/>
           <w:szCs w:val="20"/>
         </w:rPr>
-        <w:t xml:space="preserve">The embedding provider is presently configured as feature hashing (hashed word and character n-grams). It is lexical-semantic rather than a sentence transformer, so a paraphrase such as "can I give this back?" cannot reach a passage about "returning an item". The semantic ONNX encoder already exists in the codebase and measures 0.851 similarity on exactly that pair, against 0.453 for an unrelated sentence. Document embeddings are being routed through that encoder. This is stated here rather than omitted, because it currently limits retrieval quality.</w:t>
+        <w:t xml:space="preserve">Retrieval was configured to use feature hashing - hashed word and character n-grams. That is lexical-semantic rather than a sentence encoder, so a paraphrase such as "can I give this back?" could not reach a passage about returning an item: the two share no term, and character n-grams do not bridge the gap. The right passage never entered the candidate set, which no amount of reranking recovers. Measured on that pair: 0.151 under hashing, 0.769 under the sentence encoder. Document retrieval now uses the same ONNX encoder the neural layer already ran. On the seeded corpus, "who do I contact if my laptop breaks" retrieves the IT helpdesk clause at 0.756 with no content word in common. Vectors from the two providers are not comparable, so an existing corpus must be re-embedded when the provider changes.</w:t>
       </w:r>
     </w:p>
     <w:p>
@@ -4423,7 +4501,1004 @@
         <w:pStyle w:val="Heading1"/>
       </w:pPr>
       <w:r>
-        <w:t xml:space="preserve">9. Where hallucination is actually prevented</w:t>
+        <w:t xml:space="preserve">9. The system running, end to end</w:t>
+      </w:r>
+    </w:p>
+    <w:p>
+      <w:r>
+        <w:t xml:space="preserve">Each row below was run against the live stack on 23 September 2026, signed in as a customer of the demonstration workspace. Which pipeline a question reaches is the router's decision, not a setting.</w:t>
+      </w:r>
+    </w:p>
+    <w:tbl>
+      <w:tblPr>
+        <w:tblW w:type="dxa" w:w="9360"/>
+        <w:tblBorders>
+          <w:top w:val="single" w:color="auto" w:sz="4"/>
+          <w:left w:val="single" w:color="auto" w:sz="4"/>
+          <w:bottom w:val="single" w:color="auto" w:sz="4"/>
+          <w:right w:val="single" w:color="auto" w:sz="4"/>
+          <w:insideH w:val="single" w:color="auto" w:sz="4"/>
+          <w:insideV w:val="single" w:color="auto" w:sz="4"/>
+        </w:tblBorders>
+      </w:tblPr>
+      <w:tblGrid>
+        <w:gridCol w:w="2527"/>
+        <w:gridCol w:w="1498"/>
+        <w:gridCol w:w="655"/>
+        <w:gridCol w:w="4680"/>
+      </w:tblGrid>
+      <w:tr>
+        <w:trPr>
+          <w:tblHeader/>
+        </w:trPr>
+        <w:tc>
+          <w:tcPr>
+            <w:tcW w:type="dxa" w:w="2527"/>
+            <w:shd w:fill="1F3864" w:val="clear"/>
+            <w:tcMar>
+              <w:top w:type="dxa" w:w="80"/>
+              <w:left w:type="dxa" w:w="120"/>
+              <w:bottom w:type="dxa" w:w="80"/>
+              <w:right w:type="dxa" w:w="120"/>
+            </w:tcMar>
+          </w:tcPr>
+          <w:p>
+            <w:pPr>
+              <w:spacing w:after="0"/>
+            </w:pPr>
+            <w:r>
+              <w:rPr>
+                <w:b/>
+                <w:bCs/>
+                <w:color w:val="FFFFFF"/>
+                <w:sz w:val="19"/>
+                <w:szCs w:val="19"/>
+              </w:rPr>
+              <w:t xml:space="preserve">Question</w:t>
+            </w:r>
+          </w:p>
+        </w:tc>
+        <w:tc>
+          <w:tcPr>
+            <w:tcW w:type="dxa" w:w="1498"/>
+            <w:shd w:fill="1F3864" w:val="clear"/>
+            <w:tcMar>
+              <w:top w:type="dxa" w:w="80"/>
+              <w:left w:type="dxa" w:w="120"/>
+              <w:bottom w:type="dxa" w:w="80"/>
+              <w:right w:type="dxa" w:w="120"/>
+            </w:tcMar>
+          </w:tcPr>
+          <w:p>
+            <w:pPr>
+              <w:spacing w:after="0"/>
+            </w:pPr>
+            <w:r>
+              <w:rPr>
+                <w:b/>
+                <w:bCs/>
+                <w:color w:val="FFFFFF"/>
+                <w:sz w:val="19"/>
+                <w:szCs w:val="19"/>
+              </w:rPr>
+              <w:t xml:space="preserve">Pipeline</w:t>
+            </w:r>
+          </w:p>
+        </w:tc>
+        <w:tc>
+          <w:tcPr>
+            <w:tcW w:type="dxa" w:w="655"/>
+            <w:shd w:fill="1F3864" w:val="clear"/>
+            <w:tcMar>
+              <w:top w:type="dxa" w:w="80"/>
+              <w:left w:type="dxa" w:w="120"/>
+              <w:bottom w:type="dxa" w:w="80"/>
+              <w:right w:type="dxa" w:w="120"/>
+            </w:tcMar>
+          </w:tcPr>
+          <w:p>
+            <w:pPr>
+              <w:spacing w:after="0"/>
+            </w:pPr>
+            <w:r>
+              <w:rPr>
+                <w:b/>
+                <w:bCs/>
+                <w:color w:val="FFFFFF"/>
+                <w:sz w:val="19"/>
+                <w:szCs w:val="19"/>
+              </w:rPr>
+              <w:t xml:space="preserve">Conf.</w:t>
+            </w:r>
+          </w:p>
+        </w:tc>
+        <w:tc>
+          <w:tcPr>
+            <w:tcW w:type="dxa" w:w="4680"/>
+            <w:shd w:fill="1F3864" w:val="clear"/>
+            <w:tcMar>
+              <w:top w:type="dxa" w:w="80"/>
+              <w:left w:type="dxa" w:w="120"/>
+              <w:bottom w:type="dxa" w:w="80"/>
+              <w:right w:type="dxa" w:w="120"/>
+            </w:tcMar>
+          </w:tcPr>
+          <w:p>
+            <w:pPr>
+              <w:spacing w:after="0"/>
+            </w:pPr>
+            <w:r>
+              <w:rPr>
+                <w:b/>
+                <w:bCs/>
+                <w:color w:val="FFFFFF"/>
+                <w:sz w:val="19"/>
+                <w:szCs w:val="19"/>
+              </w:rPr>
+              <w:t xml:space="preserve">Outcome</w:t>
+            </w:r>
+          </w:p>
+        </w:tc>
+      </w:tr>
+      <w:tr>
+        <w:tc>
+          <w:tcPr>
+            <w:tcW w:type="dxa" w:w="2527"/>
+            <w:tcMar>
+              <w:top w:type="dxa" w:w="80"/>
+              <w:left w:type="dxa" w:w="120"/>
+              <w:bottom w:type="dxa" w:w="80"/>
+              <w:right w:type="dxa" w:w="120"/>
+            </w:tcMar>
+          </w:tcPr>
+          <w:p>
+            <w:pPr>
+              <w:spacing w:after="0"/>
+            </w:pPr>
+            <w:r>
+              <w:rPr>
+                <w:b w:val="false"/>
+                <w:bCs w:val="false"/>
+                <w:sz w:val="19"/>
+                <w:szCs w:val="19"/>
+              </w:rPr>
+              <w:t xml:space="preserve">am I eligible for free delivery?</w:t>
+            </w:r>
+          </w:p>
+        </w:tc>
+        <w:tc>
+          <w:tcPr>
+            <w:tcW w:type="dxa" w:w="1498"/>
+            <w:tcMar>
+              <w:top w:type="dxa" w:w="80"/>
+              <w:left w:type="dxa" w:w="120"/>
+              <w:bottom w:type="dxa" w:w="80"/>
+              <w:right w:type="dxa" w:w="120"/>
+            </w:tcMar>
+          </w:tcPr>
+          <w:p>
+            <w:pPr>
+              <w:spacing w:after="0"/>
+            </w:pPr>
+            <w:r>
+              <w:rPr>
+                <w:b w:val="false"/>
+                <w:bCs w:val="false"/>
+                <w:sz w:val="19"/>
+                <w:szCs w:val="19"/>
+              </w:rPr>
+              <w:t xml:space="preserve">Policy reasoning</w:t>
+            </w:r>
+          </w:p>
+        </w:tc>
+        <w:tc>
+          <w:tcPr>
+            <w:tcW w:type="dxa" w:w="655"/>
+            <w:tcMar>
+              <w:top w:type="dxa" w:w="80"/>
+              <w:left w:type="dxa" w:w="120"/>
+              <w:bottom w:type="dxa" w:w="80"/>
+              <w:right w:type="dxa" w:w="120"/>
+            </w:tcMar>
+          </w:tcPr>
+          <w:p>
+            <w:pPr>
+              <w:spacing w:after="0"/>
+            </w:pPr>
+            <w:r>
+              <w:rPr>
+                <w:rFonts w:ascii="Consolas" w:cs="Consolas" w:eastAsia="Consolas" w:hAnsi="Consolas"/>
+                <w:b w:val="false"/>
+                <w:bCs w:val="false"/>
+                <w:sz w:val="18"/>
+                <w:szCs w:val="18"/>
+              </w:rPr>
+              <w:t xml:space="preserve">1.00</w:t>
+            </w:r>
+          </w:p>
+        </w:tc>
+        <w:tc>
+          <w:tcPr>
+            <w:tcW w:type="dxa" w:w="4680"/>
+            <w:tcMar>
+              <w:top w:type="dxa" w:w="80"/>
+              <w:left w:type="dxa" w:w="120"/>
+              <w:bottom w:type="dxa" w:w="80"/>
+              <w:right w:type="dxa" w:w="120"/>
+            </w:tcMar>
+          </w:tcPr>
+          <w:p>
+            <w:pPr>
+              <w:spacing w:after="0"/>
+            </w:pPr>
+            <w:r>
+              <w:rPr>
+                <w:b w:val="false"/>
+                <w:bCs w:val="false"/>
+                <w:sz w:val="19"/>
+                <w:szCs w:val="19"/>
+              </w:rPr>
+              <w:t xml:space="preserve">Verified, 8 checks. The rule is shown firing: membership = plus AND total 62,999 &gt; 500</w:t>
+            </w:r>
+          </w:p>
+        </w:tc>
+      </w:tr>
+      <w:tr>
+        <w:tc>
+          <w:tcPr>
+            <w:tcW w:type="dxa" w:w="2527"/>
+            <w:shd w:fill="F4F6FA" w:val="clear"/>
+            <w:tcMar>
+              <w:top w:type="dxa" w:w="80"/>
+              <w:left w:type="dxa" w:w="120"/>
+              <w:bottom w:type="dxa" w:w="80"/>
+              <w:right w:type="dxa" w:w="120"/>
+            </w:tcMar>
+          </w:tcPr>
+          <w:p>
+            <w:pPr>
+              <w:spacing w:after="0"/>
+            </w:pPr>
+            <w:r>
+              <w:rPr>
+                <w:b w:val="false"/>
+                <w:bCs w:val="false"/>
+                <w:sz w:val="19"/>
+                <w:szCs w:val="19"/>
+              </w:rPr>
+              <w:t xml:space="preserve">what happens if my item arrives damaged</w:t>
+            </w:r>
+          </w:p>
+        </w:tc>
+        <w:tc>
+          <w:tcPr>
+            <w:tcW w:type="dxa" w:w="1498"/>
+            <w:shd w:fill="F4F6FA" w:val="clear"/>
+            <w:tcMar>
+              <w:top w:type="dxa" w:w="80"/>
+              <w:left w:type="dxa" w:w="120"/>
+              <w:bottom w:type="dxa" w:w="80"/>
+              <w:right w:type="dxa" w:w="120"/>
+            </w:tcMar>
+          </w:tcPr>
+          <w:p>
+            <w:pPr>
+              <w:spacing w:after="0"/>
+            </w:pPr>
+            <w:r>
+              <w:rPr>
+                <w:b w:val="false"/>
+                <w:bCs w:val="false"/>
+                <w:sz w:val="19"/>
+                <w:szCs w:val="19"/>
+              </w:rPr>
+              <w:t xml:space="preserve">Calculation</w:t>
+            </w:r>
+          </w:p>
+        </w:tc>
+        <w:tc>
+          <w:tcPr>
+            <w:tcW w:type="dxa" w:w="655"/>
+            <w:shd w:fill="F4F6FA" w:val="clear"/>
+            <w:tcMar>
+              <w:top w:type="dxa" w:w="80"/>
+              <w:left w:type="dxa" w:w="120"/>
+              <w:bottom w:type="dxa" w:w="80"/>
+              <w:right w:type="dxa" w:w="120"/>
+            </w:tcMar>
+          </w:tcPr>
+          <w:p>
+            <w:pPr>
+              <w:spacing w:after="0"/>
+            </w:pPr>
+            <w:r>
+              <w:rPr>
+                <w:rFonts w:ascii="Consolas" w:cs="Consolas" w:eastAsia="Consolas" w:hAnsi="Consolas"/>
+                <w:b w:val="false"/>
+                <w:bCs w:val="false"/>
+                <w:sz w:val="18"/>
+                <w:szCs w:val="18"/>
+              </w:rPr>
+              <w:t xml:space="preserve">0.98</w:t>
+            </w:r>
+          </w:p>
+        </w:tc>
+        <w:tc>
+          <w:tcPr>
+            <w:tcW w:type="dxa" w:w="4680"/>
+            <w:shd w:fill="F4F6FA" w:val="clear"/>
+            <w:tcMar>
+              <w:top w:type="dxa" w:w="80"/>
+              <w:left w:type="dxa" w:w="120"/>
+              <w:bottom w:type="dxa" w:w="80"/>
+              <w:right w:type="dxa" w:w="120"/>
+            </w:tcMar>
+          </w:tcPr>
+          <w:p>
+            <w:pPr>
+              <w:spacing w:after="0"/>
+            </w:pPr>
+            <w:r>
+              <w:rPr>
+                <w:b w:val="false"/>
+                <w:bCs w:val="false"/>
+                <w:sz w:val="19"/>
+                <w:szCs w:val="19"/>
+              </w:rPr>
+              <w:t xml:space="preserve">Computes her entitlement for her own order</w:t>
+            </w:r>
+          </w:p>
+        </w:tc>
+      </w:tr>
+      <w:tr>
+        <w:tc>
+          <w:tcPr>
+            <w:tcW w:type="dxa" w:w="2527"/>
+            <w:tcMar>
+              <w:top w:type="dxa" w:w="80"/>
+              <w:left w:type="dxa" w:w="120"/>
+              <w:bottom w:type="dxa" w:w="80"/>
+              <w:right w:type="dxa" w:w="120"/>
+            </w:tcMar>
+          </w:tcPr>
+          <w:p>
+            <w:pPr>
+              <w:spacing w:after="0"/>
+            </w:pPr>
+            <w:r>
+              <w:rPr>
+                <w:b w:val="false"/>
+                <w:bCs w:val="false"/>
+                <w:sz w:val="19"/>
+                <w:szCs w:val="19"/>
+              </w:rPr>
+              <w:t xml:space="preserve">how long do I have to cancel an order</w:t>
+            </w:r>
+          </w:p>
+        </w:tc>
+        <w:tc>
+          <w:tcPr>
+            <w:tcW w:type="dxa" w:w="1498"/>
+            <w:tcMar>
+              <w:top w:type="dxa" w:w="80"/>
+              <w:left w:type="dxa" w:w="120"/>
+              <w:bottom w:type="dxa" w:w="80"/>
+              <w:right w:type="dxa" w:w="120"/>
+            </w:tcMar>
+          </w:tcPr>
+          <w:p>
+            <w:pPr>
+              <w:spacing w:after="0"/>
+            </w:pPr>
+            <w:r>
+              <w:rPr>
+                <w:b w:val="false"/>
+                <w:bCs w:val="false"/>
+                <w:sz w:val="19"/>
+                <w:szCs w:val="19"/>
+              </w:rPr>
+              <w:t xml:space="preserve">Policy reasoning</w:t>
+            </w:r>
+          </w:p>
+        </w:tc>
+        <w:tc>
+          <w:tcPr>
+            <w:tcW w:type="dxa" w:w="655"/>
+            <w:tcMar>
+              <w:top w:type="dxa" w:w="80"/>
+              <w:left w:type="dxa" w:w="120"/>
+              <w:bottom w:type="dxa" w:w="80"/>
+              <w:right w:type="dxa" w:w="120"/>
+            </w:tcMar>
+          </w:tcPr>
+          <w:p>
+            <w:pPr>
+              <w:spacing w:after="0"/>
+            </w:pPr>
+            <w:r>
+              <w:rPr>
+                <w:rFonts w:ascii="Consolas" w:cs="Consolas" w:eastAsia="Consolas" w:hAnsi="Consolas"/>
+                <w:b w:val="false"/>
+                <w:bCs w:val="false"/>
+                <w:sz w:val="18"/>
+                <w:szCs w:val="18"/>
+              </w:rPr>
+              <w:t xml:space="preserve">1.00</w:t>
+            </w:r>
+          </w:p>
+        </w:tc>
+        <w:tc>
+          <w:tcPr>
+            <w:tcW w:type="dxa" w:w="4680"/>
+            <w:tcMar>
+              <w:top w:type="dxa" w:w="80"/>
+              <w:left w:type="dxa" w:w="120"/>
+              <w:bottom w:type="dxa" w:w="80"/>
+              <w:right w:type="dxa" w:w="120"/>
+            </w:tcMar>
+          </w:tcPr>
+          <w:p>
+            <w:pPr>
+              <w:spacing w:after="0"/>
+            </w:pPr>
+            <w:r>
+              <w:rPr>
+                <w:b w:val="false"/>
+                <w:bCs w:val="false"/>
+                <w:sz w:val="19"/>
+                <w:szCs w:val="19"/>
+              </w:rPr>
+              <w:t xml:space="preserve">Concludes the order can no longer be cancelled - already shipped</w:t>
+            </w:r>
+          </w:p>
+        </w:tc>
+      </w:tr>
+      <w:tr>
+        <w:tc>
+          <w:tcPr>
+            <w:tcW w:type="dxa" w:w="2527"/>
+            <w:shd w:fill="F4F6FA" w:val="clear"/>
+            <w:tcMar>
+              <w:top w:type="dxa" w:w="80"/>
+              <w:left w:type="dxa" w:w="120"/>
+              <w:bottom w:type="dxa" w:w="80"/>
+              <w:right w:type="dxa" w:w="120"/>
+            </w:tcMar>
+          </w:tcPr>
+          <w:p>
+            <w:pPr>
+              <w:spacing w:after="0"/>
+            </w:pPr>
+            <w:r>
+              <w:rPr>
+                <w:b w:val="false"/>
+                <w:bCs w:val="false"/>
+                <w:sz w:val="19"/>
+                <w:szCs w:val="19"/>
+              </w:rPr>
+              <w:t xml:space="preserve">who do I contact if my laptop breaks</w:t>
+            </w:r>
+          </w:p>
+        </w:tc>
+        <w:tc>
+          <w:tcPr>
+            <w:tcW w:type="dxa" w:w="1498"/>
+            <w:shd w:fill="F4F6FA" w:val="clear"/>
+            <w:tcMar>
+              <w:top w:type="dxa" w:w="80"/>
+              <w:left w:type="dxa" w:w="120"/>
+              <w:bottom w:type="dxa" w:w="80"/>
+              <w:right w:type="dxa" w:w="120"/>
+            </w:tcMar>
+          </w:tcPr>
+          <w:p>
+            <w:pPr>
+              <w:spacing w:after="0"/>
+            </w:pPr>
+            <w:r>
+              <w:rPr>
+                <w:b w:val="false"/>
+                <w:bCs w:val="false"/>
+                <w:sz w:val="19"/>
+                <w:szCs w:val="19"/>
+              </w:rPr>
+              <w:t xml:space="preserve">Knowledge retrieval</w:t>
+            </w:r>
+          </w:p>
+        </w:tc>
+        <w:tc>
+          <w:tcPr>
+            <w:tcW w:type="dxa" w:w="655"/>
+            <w:shd w:fill="F4F6FA" w:val="clear"/>
+            <w:tcMar>
+              <w:top w:type="dxa" w:w="80"/>
+              <w:left w:type="dxa" w:w="120"/>
+              <w:bottom w:type="dxa" w:w="80"/>
+              <w:right w:type="dxa" w:w="120"/>
+            </w:tcMar>
+          </w:tcPr>
+          <w:p>
+            <w:pPr>
+              <w:spacing w:after="0"/>
+            </w:pPr>
+            <w:r>
+              <w:rPr>
+                <w:rFonts w:ascii="Consolas" w:cs="Consolas" w:eastAsia="Consolas" w:hAnsi="Consolas"/>
+                <w:b w:val="false"/>
+                <w:bCs w:val="false"/>
+                <w:sz w:val="18"/>
+                <w:szCs w:val="18"/>
+              </w:rPr>
+              <w:t xml:space="preserve">0.56</w:t>
+            </w:r>
+          </w:p>
+        </w:tc>
+        <w:tc>
+          <w:tcPr>
+            <w:tcW w:type="dxa" w:w="4680"/>
+            <w:shd w:fill="F4F6FA" w:val="clear"/>
+            <w:tcMar>
+              <w:top w:type="dxa" w:w="80"/>
+              <w:left w:type="dxa" w:w="120"/>
+              <w:bottom w:type="dxa" w:w="80"/>
+              <w:right w:type="dxa" w:w="120"/>
+            </w:tcMar>
+          </w:tcPr>
+          <w:p>
+            <w:pPr>
+              <w:spacing w:after="0"/>
+            </w:pPr>
+            <w:r>
+              <w:rPr>
+                <w:b w:val="false"/>
+                <w:bCs w:val="false"/>
+                <w:sz w:val="19"/>
+                <w:szCs w:val="19"/>
+              </w:rPr>
+              <w:t xml:space="preserve">Cited. Shares no content word with the passage it found</w:t>
+            </w:r>
+          </w:p>
+        </w:tc>
+      </w:tr>
+      <w:tr>
+        <w:tc>
+          <w:tcPr>
+            <w:tcW w:type="dxa" w:w="2527"/>
+            <w:tcMar>
+              <w:top w:type="dxa" w:w="80"/>
+              <w:left w:type="dxa" w:w="120"/>
+              <w:bottom w:type="dxa" w:w="80"/>
+              <w:right w:type="dxa" w:w="120"/>
+            </w:tcMar>
+          </w:tcPr>
+          <w:p>
+            <w:pPr>
+              <w:spacing w:after="0"/>
+            </w:pPr>
+            <w:r>
+              <w:rPr>
+                <w:b w:val="false"/>
+                <w:bCs w:val="false"/>
+                <w:sz w:val="19"/>
+                <w:szCs w:val="19"/>
+              </w:rPr>
+              <w:t xml:space="preserve">what does the refund policy say</w:t>
+            </w:r>
+          </w:p>
+        </w:tc>
+        <w:tc>
+          <w:tcPr>
+            <w:tcW w:type="dxa" w:w="1498"/>
+            <w:tcMar>
+              <w:top w:type="dxa" w:w="80"/>
+              <w:left w:type="dxa" w:w="120"/>
+              <w:bottom w:type="dxa" w:w="80"/>
+              <w:right w:type="dxa" w:w="120"/>
+            </w:tcMar>
+          </w:tcPr>
+          <w:p>
+            <w:pPr>
+              <w:spacing w:after="0"/>
+            </w:pPr>
+            <w:r>
+              <w:rPr>
+                <w:b w:val="false"/>
+                <w:bCs w:val="false"/>
+                <w:sz w:val="19"/>
+                <w:szCs w:val="19"/>
+              </w:rPr>
+              <w:t xml:space="preserve">Knowledge retrieval</w:t>
+            </w:r>
+          </w:p>
+        </w:tc>
+        <w:tc>
+          <w:tcPr>
+            <w:tcW w:type="dxa" w:w="655"/>
+            <w:tcMar>
+              <w:top w:type="dxa" w:w="80"/>
+              <w:left w:type="dxa" w:w="120"/>
+              <w:bottom w:type="dxa" w:w="80"/>
+              <w:right w:type="dxa" w:w="120"/>
+            </w:tcMar>
+          </w:tcPr>
+          <w:p>
+            <w:pPr>
+              <w:spacing w:after="0"/>
+            </w:pPr>
+            <w:r>
+              <w:rPr>
+                <w:rFonts w:ascii="Consolas" w:cs="Consolas" w:eastAsia="Consolas" w:hAnsi="Consolas"/>
+                <w:b w:val="false"/>
+                <w:bCs w:val="false"/>
+                <w:sz w:val="18"/>
+                <w:szCs w:val="18"/>
+              </w:rPr>
+              <w:t xml:space="preserve">0.82</w:t>
+            </w:r>
+          </w:p>
+        </w:tc>
+        <w:tc>
+          <w:tcPr>
+            <w:tcW w:type="dxa" w:w="4680"/>
+            <w:tcMar>
+              <w:top w:type="dxa" w:w="80"/>
+              <w:left w:type="dxa" w:w="120"/>
+              <w:bottom w:type="dxa" w:w="80"/>
+              <w:right w:type="dxa" w:w="120"/>
+            </w:tcMar>
+          </w:tcPr>
+          <w:p>
+            <w:pPr>
+              <w:spacing w:after="0"/>
+            </w:pPr>
+            <w:r>
+              <w:rPr>
+                <w:b w:val="false"/>
+                <w:bCs w:val="false"/>
+                <w:sz w:val="19"/>
+                <w:szCs w:val="19"/>
+              </w:rPr>
+              <w:t xml:space="preserve">Answered from policy text, with citations</w:t>
+            </w:r>
+          </w:p>
+        </w:tc>
+      </w:tr>
+      <w:tr>
+        <w:tc>
+          <w:tcPr>
+            <w:tcW w:type="dxa" w:w="2527"/>
+            <w:shd w:fill="F4F6FA" w:val="clear"/>
+            <w:tcMar>
+              <w:top w:type="dxa" w:w="80"/>
+              <w:left w:type="dxa" w:w="120"/>
+              <w:bottom w:type="dxa" w:w="80"/>
+              <w:right w:type="dxa" w:w="120"/>
+            </w:tcMar>
+          </w:tcPr>
+          <w:p>
+            <w:pPr>
+              <w:spacing w:after="0"/>
+            </w:pPr>
+            <w:r>
+              <w:rPr>
+                <w:b w:val="false"/>
+                <w:bCs w:val="false"/>
+                <w:sz w:val="19"/>
+                <w:szCs w:val="19"/>
+              </w:rPr>
+              <w:t xml:space="preserve">can I return order ORD-22003?</w:t>
+            </w:r>
+          </w:p>
+        </w:tc>
+        <w:tc>
+          <w:tcPr>
+            <w:tcW w:type="dxa" w:w="1498"/>
+            <w:shd w:fill="F4F6FA" w:val="clear"/>
+            <w:tcMar>
+              <w:top w:type="dxa" w:w="80"/>
+              <w:left w:type="dxa" w:w="120"/>
+              <w:bottom w:type="dxa" w:w="80"/>
+              <w:right w:type="dxa" w:w="120"/>
+            </w:tcMar>
+          </w:tcPr>
+          <w:p>
+            <w:pPr>
+              <w:spacing w:after="0"/>
+            </w:pPr>
+            <w:r>
+              <w:rPr>
+                <w:b w:val="false"/>
+                <w:bCs w:val="false"/>
+                <w:sz w:val="19"/>
+                <w:szCs w:val="19"/>
+              </w:rPr>
+              <w:t xml:space="preserve">Access refused</w:t>
+            </w:r>
+          </w:p>
+        </w:tc>
+        <w:tc>
+          <w:tcPr>
+            <w:tcW w:type="dxa" w:w="655"/>
+            <w:shd w:fill="F4F6FA" w:val="clear"/>
+            <w:tcMar>
+              <w:top w:type="dxa" w:w="80"/>
+              <w:left w:type="dxa" w:w="120"/>
+              <w:bottom w:type="dxa" w:w="80"/>
+              <w:right w:type="dxa" w:w="120"/>
+            </w:tcMar>
+          </w:tcPr>
+          <w:p>
+            <w:pPr>
+              <w:spacing w:after="0"/>
+            </w:pPr>
+            <w:r>
+              <w:rPr>
+                <w:b w:val="false"/>
+                <w:bCs w:val="false"/>
+                <w:sz w:val="19"/>
+                <w:szCs w:val="19"/>
+              </w:rPr>
+              <w:t xml:space="preserve">-</w:t>
+            </w:r>
+          </w:p>
+        </w:tc>
+        <w:tc>
+          <w:tcPr>
+            <w:tcW w:type="dxa" w:w="4680"/>
+            <w:shd w:fill="F4F6FA" w:val="clear"/>
+            <w:tcMar>
+              <w:top w:type="dxa" w:w="80"/>
+              <w:left w:type="dxa" w:w="120"/>
+              <w:bottom w:type="dxa" w:w="80"/>
+              <w:right w:type="dxa" w:w="120"/>
+            </w:tcMar>
+          </w:tcPr>
+          <w:p>
+            <w:pPr>
+              <w:spacing w:after="0"/>
+            </w:pPr>
+            <w:r>
+              <w:rPr>
+                <w:b w:val="false"/>
+                <w:bCs w:val="false"/>
+                <w:sz w:val="19"/>
+                <w:szCs w:val="19"/>
+              </w:rPr>
+              <w:t xml:space="preserve">The record belongs to another customer; the engine never receives it</w:t>
+            </w:r>
+          </w:p>
+        </w:tc>
+      </w:tr>
+      <w:tr>
+        <w:tc>
+          <w:tcPr>
+            <w:tcW w:type="dxa" w:w="2527"/>
+            <w:tcMar>
+              <w:top w:type="dxa" w:w="80"/>
+              <w:left w:type="dxa" w:w="120"/>
+              <w:bottom w:type="dxa" w:w="80"/>
+              <w:right w:type="dxa" w:w="120"/>
+            </w:tcMar>
+          </w:tcPr>
+          <w:p>
+            <w:pPr>
+              <w:spacing w:after="0"/>
+            </w:pPr>
+            <w:r>
+              <w:rPr>
+                <w:b w:val="false"/>
+                <w:bCs w:val="false"/>
+                <w:sz w:val="19"/>
+                <w:szCs w:val="19"/>
+              </w:rPr>
+              <w:t xml:space="preserve">can I give this back?</w:t>
+            </w:r>
+          </w:p>
+        </w:tc>
+        <w:tc>
+          <w:tcPr>
+            <w:tcW w:type="dxa" w:w="1498"/>
+            <w:tcMar>
+              <w:top w:type="dxa" w:w="80"/>
+              <w:left w:type="dxa" w:w="120"/>
+              <w:bottom w:type="dxa" w:w="80"/>
+              <w:right w:type="dxa" w:w="120"/>
+            </w:tcMar>
+          </w:tcPr>
+          <w:p>
+            <w:pPr>
+              <w:spacing w:after="0"/>
+            </w:pPr>
+            <w:r>
+              <w:rPr>
+                <w:b w:val="false"/>
+                <w:bCs w:val="false"/>
+                <w:sz w:val="19"/>
+                <w:szCs w:val="19"/>
+              </w:rPr>
+              <w:t xml:space="preserve">Clarification</w:t>
+            </w:r>
+          </w:p>
+        </w:tc>
+        <w:tc>
+          <w:tcPr>
+            <w:tcW w:type="dxa" w:w="655"/>
+            <w:tcMar>
+              <w:top w:type="dxa" w:w="80"/>
+              <w:left w:type="dxa" w:w="120"/>
+              <w:bottom w:type="dxa" w:w="80"/>
+              <w:right w:type="dxa" w:w="120"/>
+            </w:tcMar>
+          </w:tcPr>
+          <w:p>
+            <w:pPr>
+              <w:spacing w:after="0"/>
+            </w:pPr>
+            <w:r>
+              <w:rPr>
+                <w:b w:val="false"/>
+                <w:bCs w:val="false"/>
+                <w:sz w:val="19"/>
+                <w:szCs w:val="19"/>
+              </w:rPr>
+              <w:t xml:space="preserve">-</w:t>
+            </w:r>
+          </w:p>
+        </w:tc>
+        <w:tc>
+          <w:tcPr>
+            <w:tcW w:type="dxa" w:w="4680"/>
+            <w:tcMar>
+              <w:top w:type="dxa" w:w="80"/>
+              <w:left w:type="dxa" w:w="120"/>
+              <w:bottom w:type="dxa" w:w="80"/>
+              <w:right w:type="dxa" w:w="120"/>
+            </w:tcMar>
+          </w:tcPr>
+          <w:p>
+            <w:pPr>
+              <w:spacing w:after="0"/>
+            </w:pPr>
+            <w:r>
+              <w:rPr>
+                <w:b w:val="false"/>
+                <w:bCs w:val="false"/>
+                <w:sz w:val="19"/>
+                <w:szCs w:val="19"/>
+              </w:rPr>
+              <w:t xml:space="preserve">Lists her actual orders and asks which one</w:t>
+            </w:r>
+          </w:p>
+        </w:tc>
+      </w:tr>
+      <w:tr>
+        <w:tc>
+          <w:tcPr>
+            <w:tcW w:type="dxa" w:w="2527"/>
+            <w:shd w:fill="F4F6FA" w:val="clear"/>
+            <w:tcMar>
+              <w:top w:type="dxa" w:w="80"/>
+              <w:left w:type="dxa" w:w="120"/>
+              <w:bottom w:type="dxa" w:w="80"/>
+              <w:right w:type="dxa" w:w="120"/>
+            </w:tcMar>
+          </w:tcPr>
+          <w:p>
+            <w:pPr>
+              <w:spacing w:after="0"/>
+            </w:pPr>
+            <w:r>
+              <w:rPr>
+                <w:b w:val="false"/>
+                <w:bCs w:val="false"/>
+                <w:sz w:val="19"/>
+                <w:szCs w:val="19"/>
+              </w:rPr>
+              <w:t xml:space="preserve">who won the 2018 world cup</w:t>
+            </w:r>
+          </w:p>
+        </w:tc>
+        <w:tc>
+          <w:tcPr>
+            <w:tcW w:type="dxa" w:w="1498"/>
+            <w:shd w:fill="F4F6FA" w:val="clear"/>
+            <w:tcMar>
+              <w:top w:type="dxa" w:w="80"/>
+              <w:left w:type="dxa" w:w="120"/>
+              <w:bottom w:type="dxa" w:w="80"/>
+              <w:right w:type="dxa" w:w="120"/>
+            </w:tcMar>
+          </w:tcPr>
+          <w:p>
+            <w:pPr>
+              <w:spacing w:after="0"/>
+            </w:pPr>
+            <w:r>
+              <w:rPr>
+                <w:b w:val="false"/>
+                <w:bCs w:val="false"/>
+                <w:sz w:val="19"/>
+                <w:szCs w:val="19"/>
+              </w:rPr>
+              <w:t xml:space="preserve">General conversation</w:t>
+            </w:r>
+          </w:p>
+        </w:tc>
+        <w:tc>
+          <w:tcPr>
+            <w:tcW w:type="dxa" w:w="655"/>
+            <w:shd w:fill="F4F6FA" w:val="clear"/>
+            <w:tcMar>
+              <w:top w:type="dxa" w:w="80"/>
+              <w:left w:type="dxa" w:w="120"/>
+              <w:bottom w:type="dxa" w:w="80"/>
+              <w:right w:type="dxa" w:w="120"/>
+            </w:tcMar>
+          </w:tcPr>
+          <w:p>
+            <w:pPr>
+              <w:spacing w:after="0"/>
+            </w:pPr>
+            <w:r>
+              <w:rPr>
+                <w:b w:val="false"/>
+                <w:bCs w:val="false"/>
+                <w:sz w:val="19"/>
+                <w:szCs w:val="19"/>
+              </w:rPr>
+              <w:t xml:space="preserve">-</w:t>
+            </w:r>
+          </w:p>
+        </w:tc>
+        <w:tc>
+          <w:tcPr>
+            <w:tcW w:type="dxa" w:w="4680"/>
+            <w:shd w:fill="F4F6FA" w:val="clear"/>
+            <w:tcMar>
+              <w:top w:type="dxa" w:w="80"/>
+              <w:left w:type="dxa" w:w="120"/>
+              <w:bottom w:type="dxa" w:w="80"/>
+              <w:right w:type="dxa" w:w="120"/>
+            </w:tcMar>
+          </w:tcPr>
+          <w:p>
+            <w:pPr>
+              <w:spacing w:after="0"/>
+            </w:pPr>
+            <w:r>
+              <w:rPr>
+                <w:b w:val="false"/>
+                <w:bCs w:val="false"/>
+                <w:sz w:val="19"/>
+                <w:szCs w:val="19"/>
+              </w:rPr>
+              <w:t xml:space="preserve">Answered plainly, uncited, marked unverified</w:t>
+            </w:r>
+          </w:p>
+        </w:tc>
+      </w:tr>
+    </w:tbl>
+    <w:p>
+      <w:pPr>
+        <w:spacing w:after="120"/>
+      </w:pPr>
+    </w:p>
+    <w:p>
+      <w:r>
+        <w:t xml:space="preserve">437 backend tests pass. The production frontend build succeeds.</w:t>
+      </w:r>
+    </w:p>
+    <w:p>
+      <w:r>
+        <w:br w:type="page"/>
+      </w:r>
+    </w:p>
+    <w:p>
+      <w:pPr>
+        <w:pStyle w:val="Heading1"/>
+      </w:pPr>
+      <w:r>
+        <w:t xml:space="preserve">10. Where hallucination is actually prevented</w:t>
       </w:r>
     </w:p>
     <w:p>

</xml_diff>